<commit_message>
Final modelling results and formatting
</commit_message>
<xml_diff>
--- a/DMI_ProjectReport.docx
+++ b/DMI_ProjectReport.docx
@@ -179,15 +179,7 @@
         <w:t xml:space="preserve"> columns, we see two separate groups of points. However, one of these groups seems to be in the middle of the sea, so I will assume that this is an error</w:t>
       </w:r>
       <w:r>
-        <w:t xml:space="preserve">. This would leave us with only 41% of data being correct, so these variables should be dropped. </w:t>
-      </w:r>
-      <w:proofErr w:type="gramStart"/>
-      <w:r>
-        <w:t>Luckily</w:t>
-      </w:r>
-      <w:proofErr w:type="gramEnd"/>
-      <w:r>
-        <w:t xml:space="preserve"> we have </w:t>
+        <w:t xml:space="preserve">. This would leave us with only 41% of data being correct, so these variables should be dropped. Luckily we have </w:t>
       </w:r>
       <w:proofErr w:type="spellStart"/>
       <w:r>
@@ -215,15 +207,7 @@
       </w:r>
       <w:proofErr w:type="spellEnd"/>
       <w:r>
-        <w:t xml:space="preserve"> (for the case that the missing values are not at random). I will also </w:t>
-      </w:r>
-      <w:proofErr w:type="gramStart"/>
-      <w:r>
-        <w:t>make the assumption</w:t>
-      </w:r>
-      <w:proofErr w:type="gramEnd"/>
-      <w:r>
-        <w:t xml:space="preserve"> that these codes represent areas in a metropolitan area for cluster interpretation further on.</w:t>
+        <w:t xml:space="preserve"> (for the case that the missing values are not at random). I will also make the assumption that these codes represent areas in a metropolitan area for cluster interpretation further on.</w:t>
       </w:r>
     </w:p>
     <w:p>
@@ -251,7 +235,7 @@
                     <pic:cNvPicPr/>
                   </pic:nvPicPr>
                   <pic:blipFill>
-                    <a:blip r:embed="rId5"/>
+                    <a:blip r:embed="rId7"/>
                     <a:stretch>
                       <a:fillRect/>
                     </a:stretch>
@@ -288,7 +272,7 @@
                     <pic:cNvPicPr/>
                   </pic:nvPicPr>
                   <pic:blipFill rotWithShape="1">
-                    <a:blip r:embed="rId6"/>
+                    <a:blip r:embed="rId8"/>
                     <a:srcRect l="42292" r="30124" b="66497"/>
                     <a:stretch>
                       <a:fillRect/>
@@ -423,59 +407,30 @@
           <w:b/>
           <w:bCs/>
         </w:rPr>
-        <w:t>ID_Store_</w:t>
-      </w:r>
-      <w:proofErr w:type="gramStart"/>
+        <w:t>ID_Store_last</w:t>
+      </w:r>
+      <w:proofErr w:type="spellEnd"/>
       <w:r>
         <w:rPr>
           <w:b/>
           <w:bCs/>
         </w:rPr>
-        <w:t>last</w:t>
-      </w:r>
-      <w:proofErr w:type="spellEnd"/>
+        <w:t xml:space="preserve"> </w:t>
+      </w:r>
+      <w:r>
+        <w:t xml:space="preserve"> and </w:t>
+      </w:r>
+      <w:proofErr w:type="spellStart"/>
       <w:r>
         <w:rPr>
           <w:b/>
           <w:bCs/>
         </w:rPr>
-        <w:t xml:space="preserve"> </w:t>
-      </w:r>
-      <w:r>
-        <w:t xml:space="preserve"> and</w:t>
-      </w:r>
-      <w:proofErr w:type="gramEnd"/>
-      <w:r>
-        <w:t xml:space="preserve"> </w:t>
-      </w:r>
-      <w:proofErr w:type="spellStart"/>
-      <w:proofErr w:type="gramStart"/>
-      <w:r>
-        <w:rPr>
-          <w:b/>
-          <w:bCs/>
-        </w:rPr>
-        <w:t>Checked</w:t>
-      </w:r>
-      <w:proofErr w:type="gramEnd"/>
-      <w:r>
-        <w:rPr>
-          <w:b/>
-          <w:bCs/>
-        </w:rPr>
-        <w:t>_ok</w:t>
+        <w:t>Checked_ok</w:t>
       </w:r>
       <w:proofErr w:type="spellEnd"/>
       <w:r>
-        <w:t xml:space="preserve"> add no useful information to the clustering due to only having 1 unique value. </w:t>
-      </w:r>
-      <w:proofErr w:type="gramStart"/>
-      <w:r>
-        <w:t>Thus</w:t>
-      </w:r>
-      <w:proofErr w:type="gramEnd"/>
-      <w:r>
-        <w:t xml:space="preserve"> they will be dropped.</w:t>
+        <w:t xml:space="preserve"> add no useful information to the clustering due to only having 1 unique value. Thus they will be dropped.</w:t>
       </w:r>
     </w:p>
     <w:p>
@@ -2462,15 +2417,7 @@
         <w:ind w:firstLine="720"/>
       </w:pPr>
       <w:r>
-        <w:t xml:space="preserve">In general, a variable should be removed if it includes so many missing values such that it adds little information to </w:t>
-      </w:r>
-      <w:proofErr w:type="gramStart"/>
-      <w:r>
-        <w:t>the final result</w:t>
-      </w:r>
-      <w:proofErr w:type="gramEnd"/>
-      <w:r>
-        <w:t xml:space="preserve"> (rule of thumb being around 40%). However, if these values are meaningful, we may instead choose to fill them manually or impute with a specific function. </w:t>
+        <w:t xml:space="preserve">In general, a variable should be removed if it includes so many missing values such that it adds little information to the final result (rule of thumb being around 40%). However, if these values are meaningful, we may instead choose to fill them manually or impute with a specific function. </w:t>
       </w:r>
     </w:p>
     <w:p>
@@ -2634,10 +2581,15 @@
         <w:t xml:space="preserve"> applied to the product columns to handle outliers in scaling, and a Standard Scaler was applied to all numeric columns.</w:t>
       </w:r>
       <w:r>
-        <w:t xml:space="preserve"> Despite being sensitive to outliers, this is still the best choice of scaler since we want to preserve as much of the original structure and distributions as possible.</w:t>
+        <w:t xml:space="preserve"> Despite being sensitive to outliers, this is still the best choice of scaler since we want to preserve as much of the original structure and distributions as possible</w:t>
+      </w:r>
+      <w:r>
+        <w:t xml:space="preserve"> since we want to use PCA further on</w:t>
+      </w:r>
+      <w:r>
+        <w:t>.</w:t>
       </w:r>
     </w:p>
-    <w:p/>
     <w:p>
       <w:pPr>
         <w:pStyle w:val="Heading1"/>
@@ -2674,6 +2626,9 @@
       <w:r>
         <w:t>Perspective clustering + Merging</w:t>
       </w:r>
+      <w:r>
+        <w:t xml:space="preserve"> results</w:t>
+      </w:r>
     </w:p>
     <w:p>
       <w:pPr>
@@ -2705,7 +2660,10 @@
         <w:t xml:space="preserve">3.1. </w:t>
       </w:r>
       <w:r>
-        <w:t>Noise removal – DBSCAN</w:t>
+        <w:t xml:space="preserve">Noise removal – </w:t>
+      </w:r>
+      <w:r>
+        <w:t>PCA &amp; DBSCAN</w:t>
       </w:r>
     </w:p>
     <w:p>
@@ -2714,23 +2672,39 @@
         <w:jc w:val="both"/>
       </w:pPr>
       <w:r>
-        <w:t xml:space="preserve">The dataset in this </w:t>
-      </w:r>
-      <w:proofErr w:type="gramStart"/>
-      <w:r>
-        <w:t>case study</w:t>
-      </w:r>
-      <w:proofErr w:type="gramEnd"/>
-      <w:r>
-        <w:t xml:space="preserve"> is extremely noisy, even after feature engineering and scaling. It is thus essential to remove the rows that would negatively affect the clustering results (noise) and that do not represent </w:t>
-      </w:r>
-      <w:proofErr w:type="gramStart"/>
-      <w:r>
-        <w:t>the majority of</w:t>
-      </w:r>
-      <w:proofErr w:type="gramEnd"/>
-      <w:r>
-        <w:t xml:space="preserve"> the clients. For this, the best model to use is DBSCAN</w:t>
+        <w:t>The dataset in this case study is extremely noisy</w:t>
+      </w:r>
+      <w:r>
+        <w:t>.</w:t>
+      </w:r>
+      <w:r>
+        <w:t xml:space="preserve"> </w:t>
+      </w:r>
+      <w:r>
+        <w:t>E</w:t>
+      </w:r>
+      <w:r>
+        <w:t>ven after feature engineering</w:t>
+      </w:r>
+      <w:r>
+        <w:t xml:space="preserve">, </w:t>
+      </w:r>
+      <w:proofErr w:type="spellStart"/>
+      <w:r>
+        <w:t>windsorization</w:t>
+      </w:r>
+      <w:proofErr w:type="spellEnd"/>
+      <w:r>
+        <w:t xml:space="preserve"> and scaling</w:t>
+      </w:r>
+      <w:r>
+        <w:t>, the cluster results were still too messy to be interpretable</w:t>
+      </w:r>
+      <w:r>
+        <w:t>.</w:t>
+      </w:r>
+      <w:r>
+        <w:t xml:space="preserve"> As such, a step was added to try to reduce the impact of the noise rows (non-representative data points that deviate from the patterns in data) by removing the rows identified by DBSCAN as “noisy”. For this, PCA was used to reduce dimensionality, so DBSCAN works at its best. Around 8% of rows were removed by this method.</w:t>
       </w:r>
     </w:p>
     <w:p>
@@ -2743,18 +2717,29 @@
     </w:p>
     <w:p>
       <w:pPr>
-        <w:pStyle w:val="Heading3"/>
-      </w:pPr>
-      <w:r>
-        <w:t>3.2.1. Value clustering – RFM</w:t>
+        <w:ind w:firstLine="720"/>
+        <w:jc w:val="both"/>
+      </w:pPr>
+      <w:r>
+        <w:t xml:space="preserve">In perspective clustering, the goal is to </w:t>
+      </w:r>
+      <w:r>
+        <w:t>join</w:t>
+      </w:r>
+      <w:r>
+        <w:t xml:space="preserve"> different views on </w:t>
+      </w:r>
+      <w:r>
+        <w:t>the patterns found in data from different models and sets of variables. This is an interesting approach to clustering given it attempts to have the last model bias possible, while at the same time allowing for choosing the most appropriate model for each of the sets of variables.</w:t>
       </w:r>
     </w:p>
     <w:p>
       <w:pPr>
-        <w:pStyle w:val="Heading3"/>
-      </w:pPr>
-      <w:r>
-        <w:t>3.2.2. Purchase behavior clustering – Agglomerative Hierarchical</w:t>
+        <w:ind w:firstLine="720"/>
+        <w:jc w:val="both"/>
+      </w:pPr>
+      <w:r>
+        <w:t>In this case study, the perspectives in question are Value clustering, through simple RFM (Recency, Frequency, Monetary); and Basket/Purchase behavior clustering, through K-Means.</w:t>
       </w:r>
     </w:p>
     <w:p>
@@ -2762,15 +2747,95 @@
         <w:pStyle w:val="Heading3"/>
       </w:pPr>
       <w:r>
-        <w:t>3.2.3. Results</w:t>
+        <w:t>3.2.1. Value clustering – RFM</w:t>
       </w:r>
     </w:p>
     <w:p>
       <w:pPr>
+        <w:ind w:firstLine="720"/>
+      </w:pPr>
+      <w:r>
+        <w:t>RFM does not need scaled variables since we are grouping them individually, by percentiles, and not comparing the raw variables with each other.</w:t>
+      </w:r>
+      <w:r>
+        <w:t xml:space="preserve"> This is a simple process wherein we create 3x3x3 clusters based only on each customer’s Recency, Frequency and total spent on the store. The cluster 333 would be the best new customers, 133 the best old customers, 313 big but rare spenders, and 331 old and frequent but cheap customers.</w:t>
+      </w:r>
+    </w:p>
+    <w:p>
+      <w:pPr>
+        <w:pStyle w:val="Heading3"/>
+      </w:pPr>
+      <w:r>
+        <w:lastRenderedPageBreak/>
+        <w:t xml:space="preserve">3.2.2. Purchase behavior clustering – </w:t>
+      </w:r>
+      <w:r>
+        <w:t>K-Means</w:t>
+      </w:r>
+    </w:p>
+    <w:p>
+      <w:pPr>
+        <w:pStyle w:val="Heading3"/>
+      </w:pPr>
+      <w:r>
+        <w:t>3.2.3. Results</w:t>
+      </w:r>
+    </w:p>
+    <w:p>
+      <w:r>
+        <w:t>The final table has the following format, assigning to each customer a segment per method:</w:t>
+      </w:r>
+    </w:p>
+    <w:p>
+      <w:r>
+        <w:drawing>
+          <wp:inline distT="0" distB="0" distL="0" distR="0" wp14:anchorId="3464BCF6" wp14:editId="2B01DD19">
+            <wp:extent cx="6400800" cy="2205355"/>
+            <wp:effectExtent l="0" t="0" r="0" b="4445"/>
+            <wp:docPr id="1542852000" name="Picture 1"/>
+            <wp:cNvGraphicFramePr>
+              <a:graphicFrameLocks xmlns:a="http://schemas.openxmlformats.org/drawingml/2006/main" noChangeAspect="1"/>
+            </wp:cNvGraphicFramePr>
+            <a:graphic xmlns:a="http://schemas.openxmlformats.org/drawingml/2006/main">
+              <a:graphicData uri="http://schemas.openxmlformats.org/drawingml/2006/picture">
+                <pic:pic xmlns:pic="http://schemas.openxmlformats.org/drawingml/2006/picture">
+                  <pic:nvPicPr>
+                    <pic:cNvPr id="1542852000" name=""/>
+                    <pic:cNvPicPr/>
+                  </pic:nvPicPr>
+                  <pic:blipFill>
+                    <a:blip r:embed="rId9"/>
+                    <a:stretch>
+                      <a:fillRect/>
+                    </a:stretch>
+                  </pic:blipFill>
+                  <pic:spPr>
+                    <a:xfrm>
+                      <a:off x="0" y="0"/>
+                      <a:ext cx="6400800" cy="2205355"/>
+                    </a:xfrm>
+                    <a:prstGeom prst="rect">
+                      <a:avLst/>
+                    </a:prstGeom>
+                  </pic:spPr>
+                </pic:pic>
+              </a:graphicData>
+            </a:graphic>
+          </wp:inline>
+        </w:drawing>
+      </w:r>
+    </w:p>
+    <w:p>
+      <w:pPr>
         <w:pStyle w:val="Heading2"/>
       </w:pPr>
       <w:r>
         <w:t>3.3. Optimized full dataset clustering – HDBSCAN</w:t>
+      </w:r>
+    </w:p>
+    <w:p>
+      <w:r>
+        <w:t xml:space="preserve">The final clustering solution presented is a full pipeline including noise removal and </w:t>
       </w:r>
     </w:p>
     <w:p>
@@ -2818,15 +2883,7 @@
         <w:t xml:space="preserve">here </w:t>
       </w:r>
       <w:r>
-        <w:t xml:space="preserve">is a short, somewhat speculative description </w:t>
-      </w:r>
-      <w:proofErr w:type="gramStart"/>
-      <w:r>
-        <w:t>on</w:t>
-      </w:r>
-      <w:proofErr w:type="gramEnd"/>
-      <w:r>
-        <w:t xml:space="preserve"> who these people might be based on the averages of their cluster</w:t>
+        <w:t>is a short, somewhat speculative description on who these people might be based on the averages of their cluster</w:t>
       </w:r>
       <w:r>
         <w:t>.</w:t>
@@ -2841,10 +2898,20 @@
         <w:jc w:val="both"/>
       </w:pPr>
       <w:r>
-        <w:t>Note: an assumption was made that zip codes represent areas within a city or metropolitan area.</w:t>
-      </w:r>
-      <w:r>
-        <w:t xml:space="preserve"> This is the type of information one would in theory have if this project was with a real client, so there should not be an issue here.</w:t>
+        <w:t xml:space="preserve">Note: </w:t>
+      </w:r>
+      <w:r>
+        <w:t xml:space="preserve">This analysis was done based on the </w:t>
+      </w:r>
+      <w:r>
+        <w:rPr>
+          <w:i/>
+          <w:iCs/>
+        </w:rPr>
+        <w:t>cluster_results.csv</w:t>
+      </w:r>
+      <w:r>
+        <w:t xml:space="preserve"> document, exported from the </w:t>
       </w:r>
     </w:p>
     <w:p>
@@ -3072,15 +3139,7 @@
         <w:t>‑</w:t>
       </w:r>
       <w:r>
-        <w:t xml:space="preserve">value and loyal, </w:t>
-      </w:r>
-      <w:proofErr w:type="gramStart"/>
-      <w:r>
-        <w:t>so</w:t>
-      </w:r>
-      <w:proofErr w:type="gramEnd"/>
-      <w:r>
-        <w:t xml:space="preserve"> reward them with tiered loyalty perks and early access to seasonal products</w:t>
+        <w:t>value and loyal, so reward them with tiered loyalty perks and early access to seasonal products</w:t>
       </w:r>
       <w:r>
         <w:t>.</w:t>
@@ -3237,89 +3296,92 @@
           <w:b/>
           <w:bCs/>
         </w:rPr>
+        <w:t xml:space="preserve">Strategy: </w:t>
+      </w:r>
+      <w:r>
+        <w:t>Use micro</w:t>
+      </w:r>
+      <w:r>
+        <w:rPr>
+          <w:rFonts w:ascii="Cambria Math" w:hAnsi="Cambria Math" w:cs="Cambria Math"/>
+        </w:rPr>
+        <w:t>‑</w:t>
+      </w:r>
+      <w:r>
+        <w:t>promotions</w:t>
+      </w:r>
+      <w:r>
+        <w:t xml:space="preserve"> </w:t>
+      </w:r>
+      <w:r>
+        <w:t>and impulse</w:t>
+      </w:r>
+      <w:r>
+        <w:rPr>
+          <w:rFonts w:ascii="Cambria Math" w:hAnsi="Cambria Math" w:cs="Cambria Math"/>
+        </w:rPr>
+        <w:t>‑</w:t>
+      </w:r>
+      <w:r>
+        <w:t xml:space="preserve">friendly offers: </w:t>
+      </w:r>
+      <w:r>
+        <w:rPr>
+          <w:rFonts w:ascii="Aptos" w:hAnsi="Aptos" w:cs="Aptos"/>
+        </w:rPr>
+        <w:t>“</w:t>
+      </w:r>
+      <w:r>
+        <w:t>grab</w:t>
+      </w:r>
+      <w:r>
+        <w:rPr>
+          <w:rFonts w:ascii="Cambria Math" w:hAnsi="Cambria Math" w:cs="Cambria Math"/>
+        </w:rPr>
+        <w:t>‑</w:t>
+      </w:r>
+      <w:r>
+        <w:t>and</w:t>
+      </w:r>
+      <w:r>
+        <w:rPr>
+          <w:rFonts w:ascii="Cambria Math" w:hAnsi="Cambria Math" w:cs="Cambria Math"/>
+        </w:rPr>
+        <w:t>‑</w:t>
+      </w:r>
+      <w:r>
+        <w:t>go combos,</w:t>
+      </w:r>
+      <w:r>
+        <w:rPr>
+          <w:rFonts w:ascii="Aptos" w:hAnsi="Aptos" w:cs="Aptos"/>
+        </w:rPr>
+        <w:t>”</w:t>
+      </w:r>
+      <w:r>
+        <w:t xml:space="preserve"> pastry + soda deals, and mobile push notifications triggered by proximity. They</w:t>
+      </w:r>
+      <w:r>
+        <w:rPr>
+          <w:rFonts w:ascii="Aptos" w:hAnsi="Aptos" w:cs="Aptos"/>
+        </w:rPr>
+        <w:t>’</w:t>
+      </w:r>
+      <w:r>
+        <w:t>re low</w:t>
+      </w:r>
+      <w:r>
+        <w:rPr>
+          <w:rFonts w:ascii="Cambria Math" w:hAnsi="Cambria Math" w:cs="Cambria Math"/>
+        </w:rPr>
+        <w:t>‑</w:t>
+      </w:r>
+      <w:r>
+        <w:t xml:space="preserve">engagement, so the goal is </w:t>
+      </w:r>
+      <w:r>
         <w:lastRenderedPageBreak/>
-        <w:t xml:space="preserve">Strategy: </w:t>
-      </w:r>
-      <w:r>
-        <w:t>Use micro</w:t>
-      </w:r>
-      <w:r>
-        <w:rPr>
-          <w:rFonts w:ascii="Cambria Math" w:hAnsi="Cambria Math" w:cs="Cambria Math"/>
-        </w:rPr>
-        <w:t>‑</w:t>
-      </w:r>
-      <w:r>
-        <w:t>promotions</w:t>
-      </w:r>
-      <w:r>
-        <w:t xml:space="preserve"> </w:t>
-      </w:r>
-      <w:r>
-        <w:t>and impulse</w:t>
-      </w:r>
-      <w:r>
-        <w:rPr>
-          <w:rFonts w:ascii="Cambria Math" w:hAnsi="Cambria Math" w:cs="Cambria Math"/>
-        </w:rPr>
-        <w:t>‑</w:t>
-      </w:r>
-      <w:r>
-        <w:t xml:space="preserve">friendly offers: </w:t>
-      </w:r>
-      <w:r>
-        <w:rPr>
-          <w:rFonts w:ascii="Aptos" w:hAnsi="Aptos" w:cs="Aptos"/>
-        </w:rPr>
-        <w:t>“</w:t>
-      </w:r>
-      <w:r>
-        <w:t>grab</w:t>
-      </w:r>
-      <w:r>
-        <w:rPr>
-          <w:rFonts w:ascii="Cambria Math" w:hAnsi="Cambria Math" w:cs="Cambria Math"/>
-        </w:rPr>
-        <w:t>‑</w:t>
-      </w:r>
-      <w:r>
-        <w:t>and</w:t>
-      </w:r>
-      <w:r>
-        <w:rPr>
-          <w:rFonts w:ascii="Cambria Math" w:hAnsi="Cambria Math" w:cs="Cambria Math"/>
-        </w:rPr>
-        <w:t>‑</w:t>
-      </w:r>
-      <w:r>
-        <w:t>go combos,</w:t>
-      </w:r>
-      <w:r>
-        <w:rPr>
-          <w:rFonts w:ascii="Aptos" w:hAnsi="Aptos" w:cs="Aptos"/>
-        </w:rPr>
-        <w:t>”</w:t>
-      </w:r>
-      <w:r>
-        <w:t xml:space="preserve"> pastry + soda deals, and mobile push notifications triggered by proximity. They</w:t>
-      </w:r>
-      <w:r>
-        <w:rPr>
-          <w:rFonts w:ascii="Aptos" w:hAnsi="Aptos" w:cs="Aptos"/>
-        </w:rPr>
-        <w:t>’</w:t>
-      </w:r>
-      <w:r>
-        <w:t>re low</w:t>
-      </w:r>
-      <w:r>
-        <w:rPr>
-          <w:rFonts w:ascii="Cambria Math" w:hAnsi="Cambria Math" w:cs="Cambria Math"/>
-        </w:rPr>
-        <w:t>‑</w:t>
-      </w:r>
-      <w:r>
-        <w:t xml:space="preserve">engagement, so the goal is to increase visit frequency, not basket size. Highlight speed: express checkout, pickup lockers, and </w:t>
+        <w:t xml:space="preserve">to increase visit frequency, not basket size. Highlight speed: express checkout, pickup lockers, and </w:t>
       </w:r>
       <w:r>
         <w:rPr>
@@ -3428,15 +3490,7 @@
       </w:r>
       <w:proofErr w:type="spellEnd"/>
       <w:r>
-        <w:t xml:space="preserve"> are budget-conscious families with strong spending </w:t>
-      </w:r>
-      <w:proofErr w:type="gramStart"/>
-      <w:r>
-        <w:t>in</w:t>
-      </w:r>
-      <w:proofErr w:type="gramEnd"/>
-      <w:r>
-        <w:t xml:space="preserve"> Dairy and Fresh Foods</w:t>
+        <w:t xml:space="preserve"> are budget-conscious families with strong spending in Dairy and Fresh Foods</w:t>
       </w:r>
       <w:r>
         <w:t>,</w:t>
@@ -3767,25 +3821,28 @@
           <w:b/>
           <w:bCs/>
         </w:rPr>
+        <w:t>Persona</w:t>
+      </w:r>
+      <w:r>
+        <w:t>:</w:t>
+      </w:r>
+      <w:r>
+        <w:t xml:space="preserve"> </w:t>
+      </w:r>
+      <w:r>
+        <w:t xml:space="preserve">The </w:t>
+      </w:r>
+      <w:proofErr w:type="spellStart"/>
+      <w:r>
+        <w:t>Almeidas</w:t>
+      </w:r>
+      <w:proofErr w:type="spellEnd"/>
+      <w:r>
+        <w:t xml:space="preserve"> are middle-to-upper-income households who buy a lot of Fresh Foods, Frozen Foods, Pastry, and Wines. They enjoy cooking but also appreciate convenience. Their </w:t>
+      </w:r>
+      <w:r>
         <w:lastRenderedPageBreak/>
-        <w:t>Persona</w:t>
-      </w:r>
-      <w:r>
-        <w:t>:</w:t>
-      </w:r>
-      <w:r>
-        <w:t xml:space="preserve"> </w:t>
-      </w:r>
-      <w:r>
-        <w:t xml:space="preserve">The </w:t>
-      </w:r>
-      <w:proofErr w:type="spellStart"/>
-      <w:r>
-        <w:t>Almeidas</w:t>
-      </w:r>
-      <w:proofErr w:type="spellEnd"/>
-      <w:r>
-        <w:t xml:space="preserve"> are middle-to-upper-income households who buy a lot of Fresh Foods, Frozen Foods, Pastry, and Wines. They enjoy cooking but also appreciate convenience. Their baskets show a taste for quality and variety. They’re loyal, profitable, and ZIP_0 concentrated — likely urban or suburban families with stable routines. They’re </w:t>
+        <w:t xml:space="preserve">baskets show a taste for quality and variety. They’re loyal, profitable, and ZIP_0 concentrated — likely urban or suburban families with stable routines. They’re </w:t>
       </w:r>
       <w:r>
         <w:t>premium</w:t>
@@ -3850,15 +3907,7 @@
         <w:t>”</w:t>
       </w:r>
       <w:r>
-        <w:t xml:space="preserve"> messaging. They respond to quality </w:t>
-      </w:r>
-      <w:proofErr w:type="gramStart"/>
-      <w:r>
-        <w:t>cues</w:t>
-      </w:r>
-      <w:proofErr w:type="gramEnd"/>
-      <w:r>
-        <w:t>, not price cuts.</w:t>
+        <w:t xml:space="preserve"> messaging. They respond to quality cues, not price cuts.</w:t>
       </w:r>
     </w:p>
     <w:p/>
@@ -3903,15 +3952,7 @@
         <w:t xml:space="preserve">Summary: </w:t>
       </w:r>
       <w:r>
-        <w:t xml:space="preserve">Deal-seekers who shop </w:t>
-      </w:r>
-      <w:proofErr w:type="gramStart"/>
-      <w:r>
-        <w:t>smart</w:t>
-      </w:r>
-      <w:proofErr w:type="gramEnd"/>
-      <w:r>
-        <w:t xml:space="preserve"> and stretch their budget.</w:t>
+        <w:t>Deal-seekers who shop smart and stretch their budget.</w:t>
       </w:r>
     </w:p>
     <w:p>
@@ -4072,23 +4113,7 @@
         <w:t>A</w:t>
       </w:r>
       <w:r>
-        <w:t xml:space="preserve">ffluent, heavy spenders across every category. They buy premium </w:t>
-      </w:r>
-      <w:proofErr w:type="gramStart"/>
-      <w:r>
-        <w:t>meats</w:t>
-      </w:r>
-      <w:proofErr w:type="gramEnd"/>
-      <w:r>
-        <w:t xml:space="preserve">, wines, fresh produce, frozen meals, toiletries, and more. Their profit contribution is massive. They also have higher returns and a higher flagged rate, typical of high-volume shoppers. They’re </w:t>
-      </w:r>
-      <w:proofErr w:type="gramStart"/>
-      <w:r>
-        <w:t>the top</w:t>
-      </w:r>
-      <w:proofErr w:type="gramEnd"/>
-      <w:r>
-        <w:t>-tier, gourmet, everything-buying power customers.</w:t>
+        <w:t>ffluent, heavy spenders across every category. They buy premium meats, wines, fresh produce, frozen meals, toiletries, and more. Their profit contribution is massive. They also have higher returns and a higher flagged rate, typical of high-volume shoppers. They’re the top-tier, gourmet, everything-buying power customers.</w:t>
       </w:r>
     </w:p>
     <w:p>
@@ -4148,15 +4173,7 @@
         <w:t>,</w:t>
       </w:r>
       <w:r>
-        <w:t xml:space="preserve"> </w:t>
-      </w:r>
-      <w:proofErr w:type="gramStart"/>
-      <w:r>
-        <w:t>treat</w:t>
-      </w:r>
-      <w:proofErr w:type="gramEnd"/>
-      <w:r>
-        <w:t xml:space="preserve"> them as elite customers.</w:t>
+        <w:t xml:space="preserve"> treat them as elite customers.</w:t>
       </w:r>
     </w:p>
     <w:p/>
@@ -4173,7 +4190,6 @@
           <w:b/>
           <w:bCs/>
         </w:rPr>
-        <w:lastRenderedPageBreak/>
         <w:t>Cluster 7</w:t>
       </w:r>
       <w:r>
@@ -4200,6 +4216,7 @@
           <w:b/>
           <w:bCs/>
         </w:rPr>
+        <w:lastRenderedPageBreak/>
         <w:t xml:space="preserve">Summary: </w:t>
       </w:r>
       <w:r>
@@ -4526,15 +4543,7 @@
         <w:t xml:space="preserve">Persona: </w:t>
       </w:r>
       <w:r>
-        <w:t xml:space="preserve">The Ferreiras buy a lot of Dairy and Fresh Foods, with low Meat, Pastry, and Sodas. They’re traditional, essentials-focused, and ZIP_0 concentrated. Their profit is lower, but they’re consistent. They’re </w:t>
-      </w:r>
-      <w:proofErr w:type="gramStart"/>
-      <w:r>
-        <w:t>the routine</w:t>
-      </w:r>
-      <w:proofErr w:type="gramEnd"/>
-      <w:r>
-        <w:t>-driven, staple-focused families</w:t>
+        <w:t>The Ferreiras buy a lot of Dairy and Fresh Foods, with low Meat, Pastry, and Sodas. They’re traditional, essentials-focused, and ZIP_0 concentrated. Their profit is lower, but they’re consistent. They’re the routine-driven, staple-focused families</w:t>
       </w:r>
       <w:r>
         <w:t xml:space="preserve"> </w:t>
@@ -5524,15 +5533,7 @@
               <w:cnfStyle w:val="000000000000" w:firstRow="0" w:lastRow="0" w:firstColumn="0" w:lastColumn="0" w:oddVBand="0" w:evenVBand="0" w:oddHBand="0" w:evenHBand="0" w:firstRowFirstColumn="0" w:firstRowLastColumn="0" w:lastRowFirstColumn="0" w:lastRowLastColumn="0"/>
             </w:pPr>
             <w:r>
-              <w:t xml:space="preserve">High </w:t>
-            </w:r>
-            <w:proofErr w:type="gramStart"/>
-            <w:r>
-              <w:t>spend</w:t>
-            </w:r>
-            <w:proofErr w:type="gramEnd"/>
-            <w:r>
-              <w:t xml:space="preserve"> across premium categories; respond to curated experiences.</w:t>
+              <w:t>High spend across premium categories; respond to curated experiences.</w:t>
             </w:r>
           </w:p>
         </w:tc>
@@ -5597,7 +5598,99 @@
       </w:tr>
     </w:tbl>
     <w:p/>
+    <w:p>
+      <w:pPr>
+        <w:rPr>
+          <w:rFonts w:asciiTheme="majorHAnsi" w:eastAsiaTheme="majorEastAsia" w:hAnsiTheme="majorHAnsi" w:cstheme="majorBidi"/>
+          <w:color w:val="0F4761" w:themeColor="accent1" w:themeShade="BF"/>
+          <w:sz w:val="40"/>
+          <w:szCs w:val="40"/>
+        </w:rPr>
+      </w:pPr>
+      <w:r>
+        <w:br w:type="page"/>
+      </w:r>
+    </w:p>
+    <w:p>
+      <w:pPr>
+        <w:pStyle w:val="Heading1"/>
+      </w:pPr>
+      <w:r>
+        <w:lastRenderedPageBreak/>
+        <w:t>Annex 1: Disclaimer on Generative AI use</w:t>
+      </w:r>
+    </w:p>
+    <w:p>
+      <w:pPr>
+        <w:ind w:firstLine="720"/>
+      </w:pPr>
+      <w:r>
+        <w:t>No generative AI tools were used in the production of this report, however the tools Microsoft Copilot and GitHub Copilot were used in some sections of the underlying code. AI tool use was restricted to research, definitions and basic code, never the overall structure, decision-making or interpretation.</w:t>
+      </w:r>
+    </w:p>
+    <w:p>
+      <w:pPr>
+        <w:ind w:firstLine="720"/>
+      </w:pPr>
+      <w:r>
+        <w:t>No specific prompt engineering techniques were used, just simple prompts like:</w:t>
+      </w:r>
+    </w:p>
+    <w:p>
+      <w:pPr>
+        <w:pStyle w:val="ListParagraph"/>
+        <w:numPr>
+          <w:ilvl w:val="0"/>
+          <w:numId w:val="60"/>
+        </w:numPr>
+      </w:pPr>
+      <w:r>
+        <w:t xml:space="preserve">“Create python code for a multiplot of numeric column distributions of a </w:t>
+      </w:r>
+      <w:proofErr w:type="spellStart"/>
+      <w:r>
+        <w:t>dataframe</w:t>
+      </w:r>
+      <w:proofErr w:type="spellEnd"/>
+      <w:r>
+        <w:t>”</w:t>
+      </w:r>
+    </w:p>
+    <w:p>
+      <w:pPr>
+        <w:pStyle w:val="ListParagraph"/>
+        <w:numPr>
+          <w:ilvl w:val="0"/>
+          <w:numId w:val="60"/>
+        </w:numPr>
+      </w:pPr>
+      <w:r>
+        <w:t xml:space="preserve">“Define, with references, the process of </w:t>
+      </w:r>
+      <w:proofErr w:type="spellStart"/>
+      <w:r>
+        <w:t>windsorization</w:t>
+      </w:r>
+      <w:proofErr w:type="spellEnd"/>
+      <w:r>
+        <w:t>”</w:t>
+      </w:r>
+    </w:p>
+    <w:p>
+      <w:pPr>
+        <w:pStyle w:val="ListParagraph"/>
+        <w:numPr>
+          <w:ilvl w:val="0"/>
+          <w:numId w:val="60"/>
+        </w:numPr>
+      </w:pPr>
+      <w:r>
+        <w:t>“Give me the full list of parameters of the function HDBSCAN”</w:t>
+      </w:r>
+    </w:p>
     <w:sectPr>
+      <w:headerReference w:type="default" r:id="rId10"/>
+      <w:footerReference w:type="default" r:id="rId11"/>
       <w:pgSz w:w="12240" w:h="15840"/>
       <w:pgMar w:top="1440" w:right="1080" w:bottom="1440" w:left="1080" w:header="720" w:footer="720" w:gutter="0"/>
       <w:cols w:space="720"/>
@@ -5607,6 +5700,126 @@
 </w:document>
 </file>
 
+<file path=word/endnotes.xml><?xml version="1.0" encoding="utf-8"?>
+<w:endnotes xmlns:wpc="http://schemas.microsoft.com/office/word/2010/wordprocessingCanvas" xmlns:cx="http://schemas.microsoft.com/office/drawing/2014/chartex" xmlns:cx1="http://schemas.microsoft.com/office/drawing/2015/9/8/chartex" xmlns:cx2="http://schemas.microsoft.com/office/drawing/2015/10/21/chartex" xmlns:cx3="http://schemas.microsoft.com/office/drawing/2016/5/9/chartex" xmlns:cx4="http://schemas.microsoft.com/office/drawing/2016/5/10/chartex" xmlns:cx5="http://schemas.microsoft.com/office/drawing/2016/5/11/chartex" xmlns:cx6="http://schemas.microsoft.com/office/drawing/2016/5/12/chartex" xmlns:cx7="http://schemas.microsoft.com/office/drawing/2016/5/13/chartex" xmlns:cx8="http://schemas.microsoft.com/office/drawing/2016/5/14/chartex" xmlns:mc="http://schemas.openxmlformats.org/markup-compatibility/2006" xmlns:aink="http://schemas.microsoft.com/office/drawing/2016/ink" xmlns:am3d="http://schemas.microsoft.com/office/drawing/2017/model3d" xmlns:o="urn:schemas-microsoft-com:office:office" xmlns:oel="http://schemas.microsoft.com/office/2019/extlst" xmlns:r="http://schemas.openxmlformats.org/officeDocument/2006/relationships" xmlns:m="http://schemas.openxmlformats.org/officeDocument/2006/math" xmlns:v="urn:schemas-microsoft-com:vml" xmlns:wp14="http://schemas.microsoft.com/office/word/2010/wordprocessingDrawing" xmlns:wp="http://schemas.openxmlformats.org/drawingml/2006/wordprocessingDrawing" xmlns:w10="urn:schemas-microsoft-com:office:word" xmlns:w="http://schemas.openxmlformats.org/wordprocessingml/2006/main" xmlns:w14="http://schemas.microsoft.com/office/word/2010/wordml" xmlns:w15="http://schemas.microsoft.com/office/word/2012/wordml" xmlns:w16cex="http://schemas.microsoft.com/office/word/2018/wordml/cex" xmlns:w16cid="http://schemas.microsoft.com/office/word/2016/wordml/cid" xmlns:w16="http://schemas.microsoft.com/office/word/2018/wordml" xmlns:w16du="http://schemas.microsoft.com/office/word/2023/wordml/word16du" xmlns:w16sdtdh="http://schemas.microsoft.com/office/word/2020/wordml/sdtdatahash" xmlns:w16sdtfl="http://schemas.microsoft.com/office/word/2024/wordml/sdtformatlock" xmlns:w16se="http://schemas.microsoft.com/office/word/2015/wordml/symex" xmlns:wpg="http://schemas.microsoft.com/office/word/2010/wordprocessingGroup" xmlns:wpi="http://schemas.microsoft.com/office/word/2010/wordprocessingInk" xmlns:wne="http://schemas.microsoft.com/office/word/2006/wordml" xmlns:wps="http://schemas.microsoft.com/office/word/2010/wordprocessingShape" mc:Ignorable="w14 w15 w16se w16cid w16 w16cex w16sdtdh w16sdtfl w16du wp14">
+  <w:endnote w:type="separator" w:id="-1">
+    <w:p>
+      <w:pPr>
+        <w:spacing w:after="0" w:line="240" w:lineRule="auto"/>
+      </w:pPr>
+      <w:r>
+        <w:separator/>
+      </w:r>
+    </w:p>
+  </w:endnote>
+  <w:endnote w:type="continuationSeparator" w:id="0">
+    <w:p>
+      <w:pPr>
+        <w:spacing w:after="0" w:line="240" w:lineRule="auto"/>
+      </w:pPr>
+      <w:r>
+        <w:continuationSeparator/>
+      </w:r>
+    </w:p>
+  </w:endnote>
+</w:endnotes>
+</file>
+
+<file path=word/footer1.xml><?xml version="1.0" encoding="utf-8"?>
+<w:ftr xmlns:wpc="http://schemas.microsoft.com/office/word/2010/wordprocessingCanvas" xmlns:cx="http://schemas.microsoft.com/office/drawing/2014/chartex" xmlns:cx1="http://schemas.microsoft.com/office/drawing/2015/9/8/chartex" xmlns:cx2="http://schemas.microsoft.com/office/drawing/2015/10/21/chartex" xmlns:cx3="http://schemas.microsoft.com/office/drawing/2016/5/9/chartex" xmlns:cx4="http://schemas.microsoft.com/office/drawing/2016/5/10/chartex" xmlns:cx5="http://schemas.microsoft.com/office/drawing/2016/5/11/chartex" xmlns:cx6="http://schemas.microsoft.com/office/drawing/2016/5/12/chartex" xmlns:cx7="http://schemas.microsoft.com/office/drawing/2016/5/13/chartex" xmlns:cx8="http://schemas.microsoft.com/office/drawing/2016/5/14/chartex" xmlns:mc="http://schemas.openxmlformats.org/markup-compatibility/2006" xmlns:aink="http://schemas.microsoft.com/office/drawing/2016/ink" xmlns:am3d="http://schemas.microsoft.com/office/drawing/2017/model3d" xmlns:o="urn:schemas-microsoft-com:office:office" xmlns:oel="http://schemas.microsoft.com/office/2019/extlst" xmlns:r="http://schemas.openxmlformats.org/officeDocument/2006/relationships" xmlns:m="http://schemas.openxmlformats.org/officeDocument/2006/math" xmlns:v="urn:schemas-microsoft-com:vml" xmlns:wp14="http://schemas.microsoft.com/office/word/2010/wordprocessingDrawing" xmlns:wp="http://schemas.openxmlformats.org/drawingml/2006/wordprocessingDrawing" xmlns:w10="urn:schemas-microsoft-com:office:word" xmlns:w="http://schemas.openxmlformats.org/wordprocessingml/2006/main" xmlns:w14="http://schemas.microsoft.com/office/word/2010/wordml" xmlns:w15="http://schemas.microsoft.com/office/word/2012/wordml" xmlns:w16cex="http://schemas.microsoft.com/office/word/2018/wordml/cex" xmlns:w16cid="http://schemas.microsoft.com/office/word/2016/wordml/cid" xmlns:w16="http://schemas.microsoft.com/office/word/2018/wordml" xmlns:w16du="http://schemas.microsoft.com/office/word/2023/wordml/word16du" xmlns:w16sdtdh="http://schemas.microsoft.com/office/word/2020/wordml/sdtdatahash" xmlns:w16sdtfl="http://schemas.microsoft.com/office/word/2024/wordml/sdtformatlock" xmlns:w16se="http://schemas.microsoft.com/office/word/2015/wordml/symex" xmlns:wpg="http://schemas.microsoft.com/office/word/2010/wordprocessingGroup" xmlns:wpi="http://schemas.microsoft.com/office/word/2010/wordprocessingInk" xmlns:wne="http://schemas.microsoft.com/office/word/2006/wordml" xmlns:wps="http://schemas.microsoft.com/office/word/2010/wordprocessingShape" mc:Ignorable="w14 w15 w16se w16cid w16 w16cex w16sdtdh w16sdtfl w16du wp14">
+  <w:sdt>
+    <w:sdtPr>
+      <w:id w:val="2023507293"/>
+      <w:docPartObj>
+        <w:docPartGallery w:val="Page Numbers (Bottom of Page)"/>
+        <w:docPartUnique/>
+      </w:docPartObj>
+    </w:sdtPr>
+    <w:sdtContent>
+      <w:p>
+        <w:pPr>
+          <w:pStyle w:val="Footer"/>
+          <w:jc w:val="right"/>
+        </w:pPr>
+        <w:r>
+          <w:t xml:space="preserve">Page | </w:t>
+        </w:r>
+        <w:r>
+          <w:fldChar w:fldCharType="begin"/>
+        </w:r>
+        <w:r>
+          <w:instrText xml:space="preserve"> PAGE   \* MERGEFORMAT </w:instrText>
+        </w:r>
+        <w:r>
+          <w:fldChar w:fldCharType="separate"/>
+        </w:r>
+        <w:r>
+          <w:rPr>
+            <w:noProof/>
+          </w:rPr>
+          <w:t>2</w:t>
+        </w:r>
+        <w:r>
+          <w:rPr>
+            <w:noProof/>
+          </w:rPr>
+          <w:fldChar w:fldCharType="end"/>
+        </w:r>
+        <w:r>
+          <w:t xml:space="preserve"> </w:t>
+        </w:r>
+      </w:p>
+    </w:sdtContent>
+  </w:sdt>
+</w:ftr>
+</file>
+
+<file path=word/footnotes.xml><?xml version="1.0" encoding="utf-8"?>
+<w:footnotes xmlns:wpc="http://schemas.microsoft.com/office/word/2010/wordprocessingCanvas" xmlns:cx="http://schemas.microsoft.com/office/drawing/2014/chartex" xmlns:cx1="http://schemas.microsoft.com/office/drawing/2015/9/8/chartex" xmlns:cx2="http://schemas.microsoft.com/office/drawing/2015/10/21/chartex" xmlns:cx3="http://schemas.microsoft.com/office/drawing/2016/5/9/chartex" xmlns:cx4="http://schemas.microsoft.com/office/drawing/2016/5/10/chartex" xmlns:cx5="http://schemas.microsoft.com/office/drawing/2016/5/11/chartex" xmlns:cx6="http://schemas.microsoft.com/office/drawing/2016/5/12/chartex" xmlns:cx7="http://schemas.microsoft.com/office/drawing/2016/5/13/chartex" xmlns:cx8="http://schemas.microsoft.com/office/drawing/2016/5/14/chartex" xmlns:mc="http://schemas.openxmlformats.org/markup-compatibility/2006" xmlns:aink="http://schemas.microsoft.com/office/drawing/2016/ink" xmlns:am3d="http://schemas.microsoft.com/office/drawing/2017/model3d" xmlns:o="urn:schemas-microsoft-com:office:office" xmlns:oel="http://schemas.microsoft.com/office/2019/extlst" xmlns:r="http://schemas.openxmlformats.org/officeDocument/2006/relationships" xmlns:m="http://schemas.openxmlformats.org/officeDocument/2006/math" xmlns:v="urn:schemas-microsoft-com:vml" xmlns:wp14="http://schemas.microsoft.com/office/word/2010/wordprocessingDrawing" xmlns:wp="http://schemas.openxmlformats.org/drawingml/2006/wordprocessingDrawing" xmlns:w10="urn:schemas-microsoft-com:office:word" xmlns:w="http://schemas.openxmlformats.org/wordprocessingml/2006/main" xmlns:w14="http://schemas.microsoft.com/office/word/2010/wordml" xmlns:w15="http://schemas.microsoft.com/office/word/2012/wordml" xmlns:w16cex="http://schemas.microsoft.com/office/word/2018/wordml/cex" xmlns:w16cid="http://schemas.microsoft.com/office/word/2016/wordml/cid" xmlns:w16="http://schemas.microsoft.com/office/word/2018/wordml" xmlns:w16du="http://schemas.microsoft.com/office/word/2023/wordml/word16du" xmlns:w16sdtdh="http://schemas.microsoft.com/office/word/2020/wordml/sdtdatahash" xmlns:w16sdtfl="http://schemas.microsoft.com/office/word/2024/wordml/sdtformatlock" xmlns:w16se="http://schemas.microsoft.com/office/word/2015/wordml/symex" xmlns:wpg="http://schemas.microsoft.com/office/word/2010/wordprocessingGroup" xmlns:wpi="http://schemas.microsoft.com/office/word/2010/wordprocessingInk" xmlns:wne="http://schemas.microsoft.com/office/word/2006/wordml" xmlns:wps="http://schemas.microsoft.com/office/word/2010/wordprocessingShape" mc:Ignorable="w14 w15 w16se w16cid w16 w16cex w16sdtdh w16sdtfl w16du wp14">
+  <w:footnote w:type="separator" w:id="-1">
+    <w:p>
+      <w:pPr>
+        <w:spacing w:after="0" w:line="240" w:lineRule="auto"/>
+      </w:pPr>
+      <w:r>
+        <w:separator/>
+      </w:r>
+    </w:p>
+  </w:footnote>
+  <w:footnote w:type="continuationSeparator" w:id="0">
+    <w:p>
+      <w:pPr>
+        <w:spacing w:after="0" w:line="240" w:lineRule="auto"/>
+      </w:pPr>
+      <w:r>
+        <w:continuationSeparator/>
+      </w:r>
+    </w:p>
+  </w:footnote>
+</w:footnotes>
+</file>
+
+<file path=word/header1.xml><?xml version="1.0" encoding="utf-8"?>
+<w:hdr xmlns:wpc="http://schemas.microsoft.com/office/word/2010/wordprocessingCanvas" xmlns:cx="http://schemas.microsoft.com/office/drawing/2014/chartex" xmlns:cx1="http://schemas.microsoft.com/office/drawing/2015/9/8/chartex" xmlns:cx2="http://schemas.microsoft.com/office/drawing/2015/10/21/chartex" xmlns:cx3="http://schemas.microsoft.com/office/drawing/2016/5/9/chartex" xmlns:cx4="http://schemas.microsoft.com/office/drawing/2016/5/10/chartex" xmlns:cx5="http://schemas.microsoft.com/office/drawing/2016/5/11/chartex" xmlns:cx6="http://schemas.microsoft.com/office/drawing/2016/5/12/chartex" xmlns:cx7="http://schemas.microsoft.com/office/drawing/2016/5/13/chartex" xmlns:cx8="http://schemas.microsoft.com/office/drawing/2016/5/14/chartex" xmlns:mc="http://schemas.openxmlformats.org/markup-compatibility/2006" xmlns:aink="http://schemas.microsoft.com/office/drawing/2016/ink" xmlns:am3d="http://schemas.microsoft.com/office/drawing/2017/model3d" xmlns:o="urn:schemas-microsoft-com:office:office" xmlns:oel="http://schemas.microsoft.com/office/2019/extlst" xmlns:r="http://schemas.openxmlformats.org/officeDocument/2006/relationships" xmlns:m="http://schemas.openxmlformats.org/officeDocument/2006/math" xmlns:v="urn:schemas-microsoft-com:vml" xmlns:wp14="http://schemas.microsoft.com/office/word/2010/wordprocessingDrawing" xmlns:wp="http://schemas.openxmlformats.org/drawingml/2006/wordprocessingDrawing" xmlns:w10="urn:schemas-microsoft-com:office:word" xmlns:w="http://schemas.openxmlformats.org/wordprocessingml/2006/main" xmlns:w14="http://schemas.microsoft.com/office/word/2010/wordml" xmlns:w15="http://schemas.microsoft.com/office/word/2012/wordml" xmlns:w16cex="http://schemas.microsoft.com/office/word/2018/wordml/cex" xmlns:w16cid="http://schemas.microsoft.com/office/word/2016/wordml/cid" xmlns:w16="http://schemas.microsoft.com/office/word/2018/wordml" xmlns:w16du="http://schemas.microsoft.com/office/word/2023/wordml/word16du" xmlns:w16sdtdh="http://schemas.microsoft.com/office/word/2020/wordml/sdtdatahash" xmlns:w16sdtfl="http://schemas.microsoft.com/office/word/2024/wordml/sdtformatlock" xmlns:w16se="http://schemas.microsoft.com/office/word/2015/wordml/symex" xmlns:wpg="http://schemas.microsoft.com/office/word/2010/wordprocessingGroup" xmlns:wpi="http://schemas.microsoft.com/office/word/2010/wordprocessingInk" xmlns:wne="http://schemas.microsoft.com/office/word/2006/wordml" xmlns:wps="http://schemas.microsoft.com/office/word/2010/wordprocessingShape" mc:Ignorable="w14 w15 w16se w16cid w16 w16cex w16sdtdh w16sdtfl w16du wp14">
+  <w:p>
+    <w:pPr>
+      <w:pStyle w:val="Header"/>
+    </w:pPr>
+    <w:r>
+      <w:t xml:space="preserve">Data Mining I                                                                                                     </w:t>
+    </w:r>
+    <w:proofErr w:type="spellStart"/>
+    <w:r>
+      <w:t>WalSmart</w:t>
+    </w:r>
+    <w:proofErr w:type="spellEnd"/>
+    <w:r>
+      <w:t xml:space="preserve"> Targeted Marketing Project</w:t>
+    </w:r>
+  </w:p>
+</w:hdr>
+</file>
+
 <file path=word/numbering.xml><?xml version="1.0" encoding="utf-8"?>
 <w:numbering xmlns:wpc="http://schemas.microsoft.com/office/word/2010/wordprocessingCanvas" xmlns:cx="http://schemas.microsoft.com/office/drawing/2014/chartex" xmlns:cx1="http://schemas.microsoft.com/office/drawing/2015/9/8/chartex" xmlns:cx2="http://schemas.microsoft.com/office/drawing/2015/10/21/chartex" xmlns:cx3="http://schemas.microsoft.com/office/drawing/2016/5/9/chartex" xmlns:cx4="http://schemas.microsoft.com/office/drawing/2016/5/10/chartex" xmlns:cx5="http://schemas.microsoft.com/office/drawing/2016/5/11/chartex" xmlns:cx6="http://schemas.microsoft.com/office/drawing/2016/5/12/chartex" xmlns:cx7="http://schemas.microsoft.com/office/drawing/2016/5/13/chartex" xmlns:cx8="http://schemas.microsoft.com/office/drawing/2016/5/14/chartex" xmlns:mc="http://schemas.openxmlformats.org/markup-compatibility/2006" xmlns:aink="http://schemas.microsoft.com/office/drawing/2016/ink" xmlns:am3d="http://schemas.microsoft.com/office/drawing/2017/model3d" xmlns:o="urn:schemas-microsoft-com:office:office" xmlns:oel="http://schemas.microsoft.com/office/2019/extlst" xmlns:r="http://schemas.openxmlformats.org/officeDocument/2006/relationships" xmlns:m="http://schemas.openxmlformats.org/officeDocument/2006/math" xmlns:v="urn:schemas-microsoft-com:vml" xmlns:wp14="http://schemas.microsoft.com/office/word/2010/wordprocessingDrawing" xmlns:wp="http://schemas.openxmlformats.org/drawingml/2006/wordprocessingDrawing" xmlns:w10="urn:schemas-microsoft-com:office:word" xmlns:w="http://schemas.openxmlformats.org/wordprocessingml/2006/main" xmlns:w14="http://schemas.microsoft.com/office/word/2010/wordml" xmlns:w15="http://schemas.microsoft.com/office/word/2012/wordml" xmlns:w16cex="http://schemas.microsoft.com/office/word/2018/wordml/cex" xmlns:w16cid="http://schemas.microsoft.com/office/word/2016/wordml/cid" xmlns:w16="http://schemas.microsoft.com/office/word/2018/wordml" xmlns:w16du="http://schemas.microsoft.com/office/word/2023/wordml/word16du" xmlns:w16sdtdh="http://schemas.microsoft.com/office/word/2020/wordml/sdtdatahash" xmlns:w16sdtfl="http://schemas.microsoft.com/office/word/2024/wordml/sdtformatlock" xmlns:w16se="http://schemas.microsoft.com/office/word/2015/wordml/symex" xmlns:wpg="http://schemas.microsoft.com/office/word/2010/wordprocessingGroup" xmlns:wpi="http://schemas.microsoft.com/office/word/2010/wordprocessingInk" xmlns:wne="http://schemas.microsoft.com/office/word/2006/wordml" xmlns:wps="http://schemas.microsoft.com/office/word/2010/wordprocessingShape" mc:Ignorable="w14 w15 w16se w16cid w16 w16cex w16sdtdh w16sdtfl w16du wp14">
   <w:abstractNum w:abstractNumId="0" w15:restartNumberingAfterBreak="0">
@@ -7861,6 +8074,119 @@
     </w:lvl>
   </w:abstractNum>
   <w:abstractNum w:abstractNumId="16" w15:restartNumberingAfterBreak="0">
+    <w:nsid w:val="1D476820"/>
+    <w:multiLevelType w:val="hybridMultilevel"/>
+    <w:tmpl w:val="BEF8DC74"/>
+    <w:lvl w:ilvl="0" w:tplc="04090001">
+      <w:start w:val="1"/>
+      <w:numFmt w:val="bullet"/>
+      <w:lvlText w:val=""/>
+      <w:lvlJc w:val="left"/>
+      <w:pPr>
+        <w:ind w:left="720" w:hanging="360"/>
+      </w:pPr>
+      <w:rPr>
+        <w:rFonts w:ascii="Symbol" w:hAnsi="Symbol" w:hint="default"/>
+      </w:rPr>
+    </w:lvl>
+    <w:lvl w:ilvl="1" w:tplc="04090003" w:tentative="1">
+      <w:start w:val="1"/>
+      <w:numFmt w:val="bullet"/>
+      <w:lvlText w:val="o"/>
+      <w:lvlJc w:val="left"/>
+      <w:pPr>
+        <w:ind w:left="1440" w:hanging="360"/>
+      </w:pPr>
+      <w:rPr>
+        <w:rFonts w:ascii="Courier New" w:hAnsi="Courier New" w:cs="Courier New" w:hint="default"/>
+      </w:rPr>
+    </w:lvl>
+    <w:lvl w:ilvl="2" w:tplc="04090005" w:tentative="1">
+      <w:start w:val="1"/>
+      <w:numFmt w:val="bullet"/>
+      <w:lvlText w:val=""/>
+      <w:lvlJc w:val="left"/>
+      <w:pPr>
+        <w:ind w:left="2160" w:hanging="360"/>
+      </w:pPr>
+      <w:rPr>
+        <w:rFonts w:ascii="Wingdings" w:hAnsi="Wingdings" w:hint="default"/>
+      </w:rPr>
+    </w:lvl>
+    <w:lvl w:ilvl="3" w:tplc="04090001" w:tentative="1">
+      <w:start w:val="1"/>
+      <w:numFmt w:val="bullet"/>
+      <w:lvlText w:val=""/>
+      <w:lvlJc w:val="left"/>
+      <w:pPr>
+        <w:ind w:left="2880" w:hanging="360"/>
+      </w:pPr>
+      <w:rPr>
+        <w:rFonts w:ascii="Symbol" w:hAnsi="Symbol" w:hint="default"/>
+      </w:rPr>
+    </w:lvl>
+    <w:lvl w:ilvl="4" w:tplc="04090003" w:tentative="1">
+      <w:start w:val="1"/>
+      <w:numFmt w:val="bullet"/>
+      <w:lvlText w:val="o"/>
+      <w:lvlJc w:val="left"/>
+      <w:pPr>
+        <w:ind w:left="3600" w:hanging="360"/>
+      </w:pPr>
+      <w:rPr>
+        <w:rFonts w:ascii="Courier New" w:hAnsi="Courier New" w:cs="Courier New" w:hint="default"/>
+      </w:rPr>
+    </w:lvl>
+    <w:lvl w:ilvl="5" w:tplc="04090005" w:tentative="1">
+      <w:start w:val="1"/>
+      <w:numFmt w:val="bullet"/>
+      <w:lvlText w:val=""/>
+      <w:lvlJc w:val="left"/>
+      <w:pPr>
+        <w:ind w:left="4320" w:hanging="360"/>
+      </w:pPr>
+      <w:rPr>
+        <w:rFonts w:ascii="Wingdings" w:hAnsi="Wingdings" w:hint="default"/>
+      </w:rPr>
+    </w:lvl>
+    <w:lvl w:ilvl="6" w:tplc="04090001" w:tentative="1">
+      <w:start w:val="1"/>
+      <w:numFmt w:val="bullet"/>
+      <w:lvlText w:val=""/>
+      <w:lvlJc w:val="left"/>
+      <w:pPr>
+        <w:ind w:left="5040" w:hanging="360"/>
+      </w:pPr>
+      <w:rPr>
+        <w:rFonts w:ascii="Symbol" w:hAnsi="Symbol" w:hint="default"/>
+      </w:rPr>
+    </w:lvl>
+    <w:lvl w:ilvl="7" w:tplc="04090003" w:tentative="1">
+      <w:start w:val="1"/>
+      <w:numFmt w:val="bullet"/>
+      <w:lvlText w:val="o"/>
+      <w:lvlJc w:val="left"/>
+      <w:pPr>
+        <w:ind w:left="5760" w:hanging="360"/>
+      </w:pPr>
+      <w:rPr>
+        <w:rFonts w:ascii="Courier New" w:hAnsi="Courier New" w:cs="Courier New" w:hint="default"/>
+      </w:rPr>
+    </w:lvl>
+    <w:lvl w:ilvl="8" w:tplc="04090005" w:tentative="1">
+      <w:start w:val="1"/>
+      <w:numFmt w:val="bullet"/>
+      <w:lvlText w:val=""/>
+      <w:lvlJc w:val="left"/>
+      <w:pPr>
+        <w:ind w:left="6480" w:hanging="360"/>
+      </w:pPr>
+      <w:rPr>
+        <w:rFonts w:ascii="Wingdings" w:hAnsi="Wingdings" w:hint="default"/>
+      </w:rPr>
+    </w:lvl>
+  </w:abstractNum>
+  <w:abstractNum w:abstractNumId="17" w15:restartNumberingAfterBreak="0">
     <w:nsid w:val="1FEE3141"/>
     <w:multiLevelType w:val="multilevel"/>
     <w:tmpl w:val="B3EC0E32"/>
@@ -8009,7 +8335,7 @@
       </w:rPr>
     </w:lvl>
   </w:abstractNum>
-  <w:abstractNum w:abstractNumId="17" w15:restartNumberingAfterBreak="0">
+  <w:abstractNum w:abstractNumId="18" w15:restartNumberingAfterBreak="0">
     <w:nsid w:val="238F4E8A"/>
     <w:multiLevelType w:val="multilevel"/>
     <w:tmpl w:val="AF24880A"/>
@@ -8158,7 +8484,7 @@
       </w:rPr>
     </w:lvl>
   </w:abstractNum>
-  <w:abstractNum w:abstractNumId="18" w15:restartNumberingAfterBreak="0">
+  <w:abstractNum w:abstractNumId="19" w15:restartNumberingAfterBreak="0">
     <w:nsid w:val="23CB59E7"/>
     <w:multiLevelType w:val="hybridMultilevel"/>
     <w:tmpl w:val="06FC67B6"/>
@@ -8247,7 +8573,7 @@
       </w:pPr>
     </w:lvl>
   </w:abstractNum>
-  <w:abstractNum w:abstractNumId="19" w15:restartNumberingAfterBreak="0">
+  <w:abstractNum w:abstractNumId="20" w15:restartNumberingAfterBreak="0">
     <w:nsid w:val="24F451E2"/>
     <w:multiLevelType w:val="multilevel"/>
     <w:tmpl w:val="3F680A0C"/>
@@ -8396,7 +8722,7 @@
       </w:rPr>
     </w:lvl>
   </w:abstractNum>
-  <w:abstractNum w:abstractNumId="20" w15:restartNumberingAfterBreak="0">
+  <w:abstractNum w:abstractNumId="21" w15:restartNumberingAfterBreak="0">
     <w:nsid w:val="27B33C7D"/>
     <w:multiLevelType w:val="hybridMultilevel"/>
     <w:tmpl w:val="3D16D1CA"/>
@@ -8508,7 +8834,7 @@
       </w:rPr>
     </w:lvl>
   </w:abstractNum>
-  <w:abstractNum w:abstractNumId="21" w15:restartNumberingAfterBreak="0">
+  <w:abstractNum w:abstractNumId="22" w15:restartNumberingAfterBreak="0">
     <w:nsid w:val="28045E14"/>
     <w:multiLevelType w:val="multilevel"/>
     <w:tmpl w:val="F530E04C"/>
@@ -8657,7 +8983,7 @@
       </w:rPr>
     </w:lvl>
   </w:abstractNum>
-  <w:abstractNum w:abstractNumId="22" w15:restartNumberingAfterBreak="0">
+  <w:abstractNum w:abstractNumId="23" w15:restartNumberingAfterBreak="0">
     <w:nsid w:val="2905598F"/>
     <w:multiLevelType w:val="multilevel"/>
     <w:tmpl w:val="02688866"/>
@@ -8806,7 +9132,7 @@
       </w:rPr>
     </w:lvl>
   </w:abstractNum>
-  <w:abstractNum w:abstractNumId="23" w15:restartNumberingAfterBreak="0">
+  <w:abstractNum w:abstractNumId="24" w15:restartNumberingAfterBreak="0">
     <w:nsid w:val="2A3B5451"/>
     <w:multiLevelType w:val="hybridMultilevel"/>
     <w:tmpl w:val="E9E0C90A"/>
@@ -8918,7 +9244,7 @@
       </w:rPr>
     </w:lvl>
   </w:abstractNum>
-  <w:abstractNum w:abstractNumId="24" w15:restartNumberingAfterBreak="0">
+  <w:abstractNum w:abstractNumId="25" w15:restartNumberingAfterBreak="0">
     <w:nsid w:val="2B947F59"/>
     <w:multiLevelType w:val="multilevel"/>
     <w:tmpl w:val="AA1CA1BE"/>
@@ -9067,7 +9393,7 @@
       </w:rPr>
     </w:lvl>
   </w:abstractNum>
-  <w:abstractNum w:abstractNumId="25" w15:restartNumberingAfterBreak="0">
+  <w:abstractNum w:abstractNumId="26" w15:restartNumberingAfterBreak="0">
     <w:nsid w:val="2BCA0DA9"/>
     <w:multiLevelType w:val="multilevel"/>
     <w:tmpl w:val="944ED892"/>
@@ -9216,7 +9542,7 @@
       </w:rPr>
     </w:lvl>
   </w:abstractNum>
-  <w:abstractNum w:abstractNumId="26" w15:restartNumberingAfterBreak="0">
+  <w:abstractNum w:abstractNumId="27" w15:restartNumberingAfterBreak="0">
     <w:nsid w:val="2E066883"/>
     <w:multiLevelType w:val="hybridMultilevel"/>
     <w:tmpl w:val="6F78CA48"/>
@@ -9329,7 +9655,7 @@
       </w:rPr>
     </w:lvl>
   </w:abstractNum>
-  <w:abstractNum w:abstractNumId="27" w15:restartNumberingAfterBreak="0">
+  <w:abstractNum w:abstractNumId="28" w15:restartNumberingAfterBreak="0">
     <w:nsid w:val="2FB872C3"/>
     <w:multiLevelType w:val="multilevel"/>
     <w:tmpl w:val="172E98BC"/>
@@ -9450,7 +9776,7 @@
       </w:rPr>
     </w:lvl>
   </w:abstractNum>
-  <w:abstractNum w:abstractNumId="28" w15:restartNumberingAfterBreak="0">
+  <w:abstractNum w:abstractNumId="29" w15:restartNumberingAfterBreak="0">
     <w:nsid w:val="316366AF"/>
     <w:multiLevelType w:val="hybridMultilevel"/>
     <w:tmpl w:val="07B4FFF6"/>
@@ -9563,7 +9889,7 @@
       </w:rPr>
     </w:lvl>
   </w:abstractNum>
-  <w:abstractNum w:abstractNumId="29" w15:restartNumberingAfterBreak="0">
+  <w:abstractNum w:abstractNumId="30" w15:restartNumberingAfterBreak="0">
     <w:nsid w:val="323B486D"/>
     <w:multiLevelType w:val="multilevel"/>
     <w:tmpl w:val="7CDEBBCC"/>
@@ -9712,7 +10038,7 @@
       </w:rPr>
     </w:lvl>
   </w:abstractNum>
-  <w:abstractNum w:abstractNumId="30" w15:restartNumberingAfterBreak="0">
+  <w:abstractNum w:abstractNumId="31" w15:restartNumberingAfterBreak="0">
     <w:nsid w:val="3622726C"/>
     <w:multiLevelType w:val="multilevel"/>
     <w:tmpl w:val="B10CCD94"/>
@@ -9861,7 +10187,7 @@
       </w:rPr>
     </w:lvl>
   </w:abstractNum>
-  <w:abstractNum w:abstractNumId="31" w15:restartNumberingAfterBreak="0">
+  <w:abstractNum w:abstractNumId="32" w15:restartNumberingAfterBreak="0">
     <w:nsid w:val="3985518F"/>
     <w:multiLevelType w:val="hybridMultilevel"/>
     <w:tmpl w:val="337A4D86"/>
@@ -9974,7 +10300,7 @@
       </w:rPr>
     </w:lvl>
   </w:abstractNum>
-  <w:abstractNum w:abstractNumId="32" w15:restartNumberingAfterBreak="0">
+  <w:abstractNum w:abstractNumId="33" w15:restartNumberingAfterBreak="0">
     <w:nsid w:val="3A620867"/>
     <w:multiLevelType w:val="multilevel"/>
     <w:tmpl w:val="10A631BC"/>
@@ -10123,7 +10449,7 @@
       </w:rPr>
     </w:lvl>
   </w:abstractNum>
-  <w:abstractNum w:abstractNumId="33" w15:restartNumberingAfterBreak="0">
+  <w:abstractNum w:abstractNumId="34" w15:restartNumberingAfterBreak="0">
     <w:nsid w:val="3B33610B"/>
     <w:multiLevelType w:val="multilevel"/>
     <w:tmpl w:val="71727C24"/>
@@ -10272,7 +10598,7 @@
       </w:rPr>
     </w:lvl>
   </w:abstractNum>
-  <w:abstractNum w:abstractNumId="34" w15:restartNumberingAfterBreak="0">
+  <w:abstractNum w:abstractNumId="35" w15:restartNumberingAfterBreak="0">
     <w:nsid w:val="3D5F20C9"/>
     <w:multiLevelType w:val="multilevel"/>
     <w:tmpl w:val="CF941DE6"/>
@@ -10421,7 +10747,7 @@
       </w:rPr>
     </w:lvl>
   </w:abstractNum>
-  <w:abstractNum w:abstractNumId="35" w15:restartNumberingAfterBreak="0">
+  <w:abstractNum w:abstractNumId="36" w15:restartNumberingAfterBreak="0">
     <w:nsid w:val="420574E6"/>
     <w:multiLevelType w:val="multilevel"/>
     <w:tmpl w:val="DC3A1C5A"/>
@@ -10570,7 +10896,7 @@
       </w:rPr>
     </w:lvl>
   </w:abstractNum>
-  <w:abstractNum w:abstractNumId="36" w15:restartNumberingAfterBreak="0">
+  <w:abstractNum w:abstractNumId="37" w15:restartNumberingAfterBreak="0">
     <w:nsid w:val="48257264"/>
     <w:multiLevelType w:val="multilevel"/>
     <w:tmpl w:val="59161F7C"/>
@@ -10719,7 +11045,7 @@
       </w:rPr>
     </w:lvl>
   </w:abstractNum>
-  <w:abstractNum w:abstractNumId="37" w15:restartNumberingAfterBreak="0">
+  <w:abstractNum w:abstractNumId="38" w15:restartNumberingAfterBreak="0">
     <w:nsid w:val="4E4B64FF"/>
     <w:multiLevelType w:val="multilevel"/>
     <w:tmpl w:val="B2E47800"/>
@@ -10868,7 +11194,7 @@
       </w:rPr>
     </w:lvl>
   </w:abstractNum>
-  <w:abstractNum w:abstractNumId="38" w15:restartNumberingAfterBreak="0">
+  <w:abstractNum w:abstractNumId="39" w15:restartNumberingAfterBreak="0">
     <w:nsid w:val="52043045"/>
     <w:multiLevelType w:val="multilevel"/>
     <w:tmpl w:val="1E783696"/>
@@ -11017,7 +11343,7 @@
       </w:rPr>
     </w:lvl>
   </w:abstractNum>
-  <w:abstractNum w:abstractNumId="39" w15:restartNumberingAfterBreak="0">
+  <w:abstractNum w:abstractNumId="40" w15:restartNumberingAfterBreak="0">
     <w:nsid w:val="557F268F"/>
     <w:multiLevelType w:val="multilevel"/>
     <w:tmpl w:val="E4C4DA4E"/>
@@ -11166,7 +11492,7 @@
       </w:rPr>
     </w:lvl>
   </w:abstractNum>
-  <w:abstractNum w:abstractNumId="40" w15:restartNumberingAfterBreak="0">
+  <w:abstractNum w:abstractNumId="41" w15:restartNumberingAfterBreak="0">
     <w:nsid w:val="578B46F0"/>
     <w:multiLevelType w:val="multilevel"/>
     <w:tmpl w:val="6DE8F450"/>
@@ -11315,7 +11641,7 @@
       </w:rPr>
     </w:lvl>
   </w:abstractNum>
-  <w:abstractNum w:abstractNumId="41" w15:restartNumberingAfterBreak="0">
+  <w:abstractNum w:abstractNumId="42" w15:restartNumberingAfterBreak="0">
     <w:nsid w:val="57FC1EFE"/>
     <w:multiLevelType w:val="multilevel"/>
     <w:tmpl w:val="7374A96A"/>
@@ -11464,7 +11790,7 @@
       </w:rPr>
     </w:lvl>
   </w:abstractNum>
-  <w:abstractNum w:abstractNumId="42" w15:restartNumberingAfterBreak="0">
+  <w:abstractNum w:abstractNumId="43" w15:restartNumberingAfterBreak="0">
     <w:nsid w:val="5AD448EC"/>
     <w:multiLevelType w:val="multilevel"/>
     <w:tmpl w:val="85627E70"/>
@@ -11613,7 +11939,7 @@
       </w:rPr>
     </w:lvl>
   </w:abstractNum>
-  <w:abstractNum w:abstractNumId="43" w15:restartNumberingAfterBreak="0">
+  <w:abstractNum w:abstractNumId="44" w15:restartNumberingAfterBreak="0">
     <w:nsid w:val="609F7037"/>
     <w:multiLevelType w:val="multilevel"/>
     <w:tmpl w:val="80EE911C"/>
@@ -11762,7 +12088,7 @@
       </w:rPr>
     </w:lvl>
   </w:abstractNum>
-  <w:abstractNum w:abstractNumId="44" w15:restartNumberingAfterBreak="0">
+  <w:abstractNum w:abstractNumId="45" w15:restartNumberingAfterBreak="0">
     <w:nsid w:val="619424B3"/>
     <w:multiLevelType w:val="hybridMultilevel"/>
     <w:tmpl w:val="36085EFE"/>
@@ -11875,7 +12201,7 @@
       </w:rPr>
     </w:lvl>
   </w:abstractNum>
-  <w:abstractNum w:abstractNumId="45" w15:restartNumberingAfterBreak="0">
+  <w:abstractNum w:abstractNumId="46" w15:restartNumberingAfterBreak="0">
     <w:nsid w:val="64247D84"/>
     <w:multiLevelType w:val="multilevel"/>
     <w:tmpl w:val="F76A53D0"/>
@@ -12024,7 +12350,7 @@
       </w:rPr>
     </w:lvl>
   </w:abstractNum>
-  <w:abstractNum w:abstractNumId="46" w15:restartNumberingAfterBreak="0">
+  <w:abstractNum w:abstractNumId="47" w15:restartNumberingAfterBreak="0">
     <w:nsid w:val="68433276"/>
     <w:multiLevelType w:val="multilevel"/>
     <w:tmpl w:val="9F6EAEF6"/>
@@ -12147,7 +12473,7 @@
       </w:rPr>
     </w:lvl>
   </w:abstractNum>
-  <w:abstractNum w:abstractNumId="47" w15:restartNumberingAfterBreak="0">
+  <w:abstractNum w:abstractNumId="48" w15:restartNumberingAfterBreak="0">
     <w:nsid w:val="68902BF0"/>
     <w:multiLevelType w:val="multilevel"/>
     <w:tmpl w:val="B30206E4"/>
@@ -12296,7 +12622,7 @@
       </w:rPr>
     </w:lvl>
   </w:abstractNum>
-  <w:abstractNum w:abstractNumId="48" w15:restartNumberingAfterBreak="0">
+  <w:abstractNum w:abstractNumId="49" w15:restartNumberingAfterBreak="0">
     <w:nsid w:val="6BEF7ED4"/>
     <w:multiLevelType w:val="multilevel"/>
     <w:tmpl w:val="D140111C"/>
@@ -12445,7 +12771,7 @@
       </w:rPr>
     </w:lvl>
   </w:abstractNum>
-  <w:abstractNum w:abstractNumId="49" w15:restartNumberingAfterBreak="0">
+  <w:abstractNum w:abstractNumId="50" w15:restartNumberingAfterBreak="0">
     <w:nsid w:val="6CA26254"/>
     <w:multiLevelType w:val="multilevel"/>
     <w:tmpl w:val="D4428F78"/>
@@ -12594,7 +12920,7 @@
       </w:rPr>
     </w:lvl>
   </w:abstractNum>
-  <w:abstractNum w:abstractNumId="50" w15:restartNumberingAfterBreak="0">
+  <w:abstractNum w:abstractNumId="51" w15:restartNumberingAfterBreak="0">
     <w:nsid w:val="6EA862CD"/>
     <w:multiLevelType w:val="multilevel"/>
     <w:tmpl w:val="32CAE192"/>
@@ -12743,7 +13069,7 @@
       </w:rPr>
     </w:lvl>
   </w:abstractNum>
-  <w:abstractNum w:abstractNumId="51" w15:restartNumberingAfterBreak="0">
+  <w:abstractNum w:abstractNumId="52" w15:restartNumberingAfterBreak="0">
     <w:nsid w:val="6FB305A3"/>
     <w:multiLevelType w:val="multilevel"/>
     <w:tmpl w:val="CC14A556"/>
@@ -12892,7 +13218,7 @@
       </w:rPr>
     </w:lvl>
   </w:abstractNum>
-  <w:abstractNum w:abstractNumId="52" w15:restartNumberingAfterBreak="0">
+  <w:abstractNum w:abstractNumId="53" w15:restartNumberingAfterBreak="0">
     <w:nsid w:val="70787C12"/>
     <w:multiLevelType w:val="multilevel"/>
     <w:tmpl w:val="1154411C"/>
@@ -13041,7 +13367,7 @@
       </w:rPr>
     </w:lvl>
   </w:abstractNum>
-  <w:abstractNum w:abstractNumId="53" w15:restartNumberingAfterBreak="0">
+  <w:abstractNum w:abstractNumId="54" w15:restartNumberingAfterBreak="0">
     <w:nsid w:val="727D0516"/>
     <w:multiLevelType w:val="hybridMultilevel"/>
     <w:tmpl w:val="817AACDA"/>
@@ -13154,7 +13480,7 @@
       </w:rPr>
     </w:lvl>
   </w:abstractNum>
-  <w:abstractNum w:abstractNumId="54" w15:restartNumberingAfterBreak="0">
+  <w:abstractNum w:abstractNumId="55" w15:restartNumberingAfterBreak="0">
     <w:nsid w:val="77681ECB"/>
     <w:multiLevelType w:val="hybridMultilevel"/>
     <w:tmpl w:val="F4F87A1C"/>
@@ -13267,7 +13593,7 @@
       </w:rPr>
     </w:lvl>
   </w:abstractNum>
-  <w:abstractNum w:abstractNumId="55" w15:restartNumberingAfterBreak="0">
+  <w:abstractNum w:abstractNumId="56" w15:restartNumberingAfterBreak="0">
     <w:nsid w:val="78546DC6"/>
     <w:multiLevelType w:val="multilevel"/>
     <w:tmpl w:val="31D06C24"/>
@@ -13416,7 +13742,7 @@
       </w:rPr>
     </w:lvl>
   </w:abstractNum>
-  <w:abstractNum w:abstractNumId="56" w15:restartNumberingAfterBreak="0">
+  <w:abstractNum w:abstractNumId="57" w15:restartNumberingAfterBreak="0">
     <w:nsid w:val="7ABD6915"/>
     <w:multiLevelType w:val="multilevel"/>
     <w:tmpl w:val="5032FC8E"/>
@@ -13565,7 +13891,7 @@
       </w:rPr>
     </w:lvl>
   </w:abstractNum>
-  <w:abstractNum w:abstractNumId="57" w15:restartNumberingAfterBreak="0">
+  <w:abstractNum w:abstractNumId="58" w15:restartNumberingAfterBreak="0">
     <w:nsid w:val="7AD04B66"/>
     <w:multiLevelType w:val="multilevel"/>
     <w:tmpl w:val="A65486DE"/>
@@ -13714,7 +14040,7 @@
       </w:rPr>
     </w:lvl>
   </w:abstractNum>
-  <w:abstractNum w:abstractNumId="58" w15:restartNumberingAfterBreak="0">
+  <w:abstractNum w:abstractNumId="59" w15:restartNumberingAfterBreak="0">
     <w:nsid w:val="7E5559AC"/>
     <w:multiLevelType w:val="multilevel"/>
     <w:tmpl w:val="B0D0AF02"/>
@@ -13867,40 +14193,40 @@
     <w:abstractNumId w:val="2"/>
   </w:num>
   <w:num w:numId="2" w16cid:durableId="1096826794">
-    <w:abstractNumId w:val="27"/>
+    <w:abstractNumId w:val="28"/>
   </w:num>
   <w:num w:numId="3" w16cid:durableId="998730244">
-    <w:abstractNumId w:val="46"/>
+    <w:abstractNumId w:val="47"/>
   </w:num>
   <w:num w:numId="4" w16cid:durableId="146678950">
-    <w:abstractNumId w:val="33"/>
+    <w:abstractNumId w:val="34"/>
   </w:num>
   <w:num w:numId="5" w16cid:durableId="362024392">
-    <w:abstractNumId w:val="22"/>
+    <w:abstractNumId w:val="23"/>
   </w:num>
   <w:num w:numId="6" w16cid:durableId="1755469192">
-    <w:abstractNumId w:val="47"/>
+    <w:abstractNumId w:val="48"/>
   </w:num>
   <w:num w:numId="7" w16cid:durableId="1357610647">
     <w:abstractNumId w:val="13"/>
   </w:num>
   <w:num w:numId="8" w16cid:durableId="247691736">
-    <w:abstractNumId w:val="30"/>
+    <w:abstractNumId w:val="31"/>
   </w:num>
   <w:num w:numId="9" w16cid:durableId="1935016093">
     <w:abstractNumId w:val="15"/>
   </w:num>
   <w:num w:numId="10" w16cid:durableId="673191699">
-    <w:abstractNumId w:val="36"/>
+    <w:abstractNumId w:val="37"/>
   </w:num>
   <w:num w:numId="11" w16cid:durableId="870724060">
-    <w:abstractNumId w:val="49"/>
+    <w:abstractNumId w:val="50"/>
   </w:num>
   <w:num w:numId="12" w16cid:durableId="884491080">
-    <w:abstractNumId w:val="56"/>
+    <w:abstractNumId w:val="57"/>
   </w:num>
   <w:num w:numId="13" w16cid:durableId="871379363">
-    <w:abstractNumId w:val="51"/>
+    <w:abstractNumId w:val="52"/>
   </w:num>
   <w:num w:numId="14" w16cid:durableId="1140267859">
     <w:abstractNumId w:val="1"/>
@@ -13912,10 +14238,10 @@
     <w:abstractNumId w:val="0"/>
   </w:num>
   <w:num w:numId="17" w16cid:durableId="1996835455">
-    <w:abstractNumId w:val="35"/>
+    <w:abstractNumId w:val="36"/>
   </w:num>
   <w:num w:numId="18" w16cid:durableId="1844858578">
-    <w:abstractNumId w:val="19"/>
+    <w:abstractNumId w:val="20"/>
   </w:num>
   <w:num w:numId="19" w16cid:durableId="952637438">
     <w:abstractNumId w:val="8"/>
@@ -13924,121 +14250,124 @@
     <w:abstractNumId w:val="9"/>
   </w:num>
   <w:num w:numId="21" w16cid:durableId="1088960252">
-    <w:abstractNumId w:val="58"/>
+    <w:abstractNumId w:val="59"/>
   </w:num>
   <w:num w:numId="22" w16cid:durableId="1787313144">
     <w:abstractNumId w:val="10"/>
   </w:num>
   <w:num w:numId="23" w16cid:durableId="1366253381">
-    <w:abstractNumId w:val="48"/>
+    <w:abstractNumId w:val="49"/>
   </w:num>
   <w:num w:numId="24" w16cid:durableId="1146624749">
     <w:abstractNumId w:val="12"/>
   </w:num>
   <w:num w:numId="25" w16cid:durableId="123617787">
-    <w:abstractNumId w:val="16"/>
+    <w:abstractNumId w:val="17"/>
   </w:num>
   <w:num w:numId="26" w16cid:durableId="829177644">
-    <w:abstractNumId w:val="57"/>
+    <w:abstractNumId w:val="58"/>
   </w:num>
   <w:num w:numId="27" w16cid:durableId="1752003190">
-    <w:abstractNumId w:val="25"/>
+    <w:abstractNumId w:val="26"/>
   </w:num>
   <w:num w:numId="28" w16cid:durableId="852106372">
-    <w:abstractNumId w:val="43"/>
+    <w:abstractNumId w:val="44"/>
   </w:num>
   <w:num w:numId="29" w16cid:durableId="27685125">
-    <w:abstractNumId w:val="29"/>
+    <w:abstractNumId w:val="30"/>
   </w:num>
   <w:num w:numId="30" w16cid:durableId="1810977929">
     <w:abstractNumId w:val="7"/>
   </w:num>
   <w:num w:numId="31" w16cid:durableId="1841777260">
-    <w:abstractNumId w:val="41"/>
+    <w:abstractNumId w:val="42"/>
   </w:num>
   <w:num w:numId="32" w16cid:durableId="1869878980">
-    <w:abstractNumId w:val="45"/>
+    <w:abstractNumId w:val="46"/>
   </w:num>
   <w:num w:numId="33" w16cid:durableId="1912616208">
     <w:abstractNumId w:val="5"/>
   </w:num>
   <w:num w:numId="34" w16cid:durableId="908806533">
-    <w:abstractNumId w:val="39"/>
+    <w:abstractNumId w:val="40"/>
   </w:num>
   <w:num w:numId="35" w16cid:durableId="1156452328">
-    <w:abstractNumId w:val="24"/>
+    <w:abstractNumId w:val="25"/>
   </w:num>
   <w:num w:numId="36" w16cid:durableId="666712237">
-    <w:abstractNumId w:val="50"/>
+    <w:abstractNumId w:val="51"/>
   </w:num>
   <w:num w:numId="37" w16cid:durableId="172689576">
-    <w:abstractNumId w:val="55"/>
+    <w:abstractNumId w:val="56"/>
   </w:num>
   <w:num w:numId="38" w16cid:durableId="1105151564">
-    <w:abstractNumId w:val="32"/>
+    <w:abstractNumId w:val="33"/>
   </w:num>
   <w:num w:numId="39" w16cid:durableId="264581788">
     <w:abstractNumId w:val="11"/>
   </w:num>
   <w:num w:numId="40" w16cid:durableId="327297307">
-    <w:abstractNumId w:val="40"/>
+    <w:abstractNumId w:val="41"/>
   </w:num>
   <w:num w:numId="41" w16cid:durableId="715353930">
-    <w:abstractNumId w:val="17"/>
+    <w:abstractNumId w:val="18"/>
   </w:num>
   <w:num w:numId="42" w16cid:durableId="1105034672">
-    <w:abstractNumId w:val="34"/>
+    <w:abstractNumId w:val="35"/>
   </w:num>
   <w:num w:numId="43" w16cid:durableId="539125335">
-    <w:abstractNumId w:val="21"/>
+    <w:abstractNumId w:val="22"/>
   </w:num>
   <w:num w:numId="44" w16cid:durableId="137038516">
-    <w:abstractNumId w:val="42"/>
+    <w:abstractNumId w:val="43"/>
   </w:num>
   <w:num w:numId="45" w16cid:durableId="2112554683">
-    <w:abstractNumId w:val="37"/>
+    <w:abstractNumId w:val="38"/>
   </w:num>
   <w:num w:numId="46" w16cid:durableId="710496226">
-    <w:abstractNumId w:val="52"/>
+    <w:abstractNumId w:val="53"/>
   </w:num>
   <w:num w:numId="47" w16cid:durableId="850417025">
-    <w:abstractNumId w:val="38"/>
+    <w:abstractNumId w:val="39"/>
   </w:num>
   <w:num w:numId="48" w16cid:durableId="949895466">
     <w:abstractNumId w:val="14"/>
   </w:num>
   <w:num w:numId="49" w16cid:durableId="1110508008">
-    <w:abstractNumId w:val="20"/>
+    <w:abstractNumId w:val="21"/>
   </w:num>
   <w:num w:numId="50" w16cid:durableId="1807696623">
     <w:abstractNumId w:val="6"/>
   </w:num>
   <w:num w:numId="51" w16cid:durableId="121077465">
-    <w:abstractNumId w:val="23"/>
+    <w:abstractNumId w:val="24"/>
   </w:num>
   <w:num w:numId="52" w16cid:durableId="36705647">
+    <w:abstractNumId w:val="55"/>
+  </w:num>
+  <w:num w:numId="53" w16cid:durableId="332269020">
     <w:abstractNumId w:val="54"/>
   </w:num>
-  <w:num w:numId="53" w16cid:durableId="332269020">
-    <w:abstractNumId w:val="53"/>
-  </w:num>
   <w:num w:numId="54" w16cid:durableId="791940087">
-    <w:abstractNumId w:val="26"/>
+    <w:abstractNumId w:val="27"/>
   </w:num>
   <w:num w:numId="55" w16cid:durableId="1777021757">
-    <w:abstractNumId w:val="44"/>
+    <w:abstractNumId w:val="45"/>
   </w:num>
   <w:num w:numId="56" w16cid:durableId="536431962">
-    <w:abstractNumId w:val="28"/>
+    <w:abstractNumId w:val="29"/>
   </w:num>
   <w:num w:numId="57" w16cid:durableId="1338187487">
-    <w:abstractNumId w:val="18"/>
+    <w:abstractNumId w:val="19"/>
   </w:num>
   <w:num w:numId="58" w16cid:durableId="1225720679">
     <w:abstractNumId w:val="3"/>
   </w:num>
   <w:num w:numId="59" w16cid:durableId="433131808">
-    <w:abstractNumId w:val="31"/>
+    <w:abstractNumId w:val="32"/>
+  </w:num>
+  <w:num w:numId="60" w16cid:durableId="136068750">
+    <w:abstractNumId w:val="16"/>
   </w:num>
 </w:numbering>
 </file>
@@ -15462,6 +15791,50 @@
       </w:tcPr>
     </w:tblStylePr>
   </w:style>
+  <w:style w:type="paragraph" w:styleId="Header">
+    <w:name w:val="header"/>
+    <w:basedOn w:val="Normal"/>
+    <w:link w:val="HeaderChar"/>
+    <w:uiPriority w:val="99"/>
+    <w:unhideWhenUsed/>
+    <w:rsid w:val="004E7BF2"/>
+    <w:pPr>
+      <w:tabs>
+        <w:tab w:val="center" w:pos="4680"/>
+        <w:tab w:val="right" w:pos="9360"/>
+      </w:tabs>
+      <w:spacing w:after="0" w:line="240" w:lineRule="auto"/>
+    </w:pPr>
+  </w:style>
+  <w:style w:type="character" w:customStyle="1" w:styleId="HeaderChar">
+    <w:name w:val="Header Char"/>
+    <w:basedOn w:val="DefaultParagraphFont"/>
+    <w:link w:val="Header"/>
+    <w:uiPriority w:val="99"/>
+    <w:rsid w:val="004E7BF2"/>
+  </w:style>
+  <w:style w:type="paragraph" w:styleId="Footer">
+    <w:name w:val="footer"/>
+    <w:basedOn w:val="Normal"/>
+    <w:link w:val="FooterChar"/>
+    <w:uiPriority w:val="99"/>
+    <w:unhideWhenUsed/>
+    <w:rsid w:val="004E7BF2"/>
+    <w:pPr>
+      <w:tabs>
+        <w:tab w:val="center" w:pos="4680"/>
+        <w:tab w:val="right" w:pos="9360"/>
+      </w:tabs>
+      <w:spacing w:after="0" w:line="240" w:lineRule="auto"/>
+    </w:pPr>
+  </w:style>
+  <w:style w:type="character" w:customStyle="1" w:styleId="FooterChar">
+    <w:name w:val="Footer Char"/>
+    <w:basedOn w:val="DefaultParagraphFont"/>
+    <w:link w:val="Footer"/>
+    <w:uiPriority w:val="99"/>
+    <w:rsid w:val="004E7BF2"/>
+  </w:style>
 </w:styles>
 </file>
 

</xml_diff>